<commit_message>
Standardize program terminology: "specialization" -> "concentration"
LENS is a concentration within the LDT M.Ed. (alongside LXD and AILE);
standardize the label across the book and program docs. Replaces the
18 program-referring "specialization"/"specialisation" occurrences with
"concentration"; the domain-expert uses ("specialist knowledge",
"regulatory specialists", "specialized cases") are a different sense and
are left untouched.

- Casebook Typst sources: README, title, howto, introduction,
  lens-companion, editors, course-index, about-lens, closing-case, cover.
- Program docs (source of record): 3 Editor Bios, 4 LECF Crosswalk,
  6 Recruitment Email (.md), with .docx shadows regenerated from the .md
  via pandoc default. Doc 2 already used "concentration" (no change).

Book and companion compile clean; shipping PDFs left for CI to regenerate.

Co-Authored-By: Claude Opus 4.8 <noreply@anthropic.com>
Claude-Session: https://claude.ai/code/session_01BottVLNSMXnmpuNYBYMFKb
</commit_message>
<xml_diff>
--- a/lens_program/3_LENS_Editor_Bios.docx
+++ b/lens_program/3_LENS_Editor_Bios.docx
@@ -55,7 +55,7 @@
         <w:pStyle w:val="BodyText"/>
       </w:pPr>
       <w:r>
-        <w:t xml:space="preserve">William Gray-Roncal, Ph.D., is Principal Research Engineer at the Johns Hopkins University Applied Physics Laboratory, where he applies systems engineering methods to challenges spanning defense, space, biomedical, and learning systems. His research, sponsored by DARPA, IARPA, NIH, and DoD, bridges computational neuroscience, artificial intelligence, and large-scale data infrastructure. He developed the College Prep and CIRCUIT workforce-development models, through which he has mentored nearly 500 students, and his current work develops quantitative measures of human cognitive performance in operational contexts. He leads the development of the LENS (Learning Engineering for Next-Generation Systems) specialization within the Johns Hopkins Master of Education in Learning Design and Technology, the program directed by James Diamond at the School of Education. Gray-Roncal holds a Ph.D. in Computer Science from Johns Hopkins, an M.S. in Electrical Engineering from the University of Southern California, and a B.S. in Electrical Engineering from Vanderbilt.</w:t>
+        <w:t xml:space="preserve">William Gray-Roncal, Ph.D., is Principal Research Engineer at the Johns Hopkins University Applied Physics Laboratory, where he applies systems engineering methods to challenges spanning defense, space, biomedical, and learning systems. His research, sponsored by DARPA, IARPA, NIH, and DoD, bridges computational neuroscience, artificial intelligence, and large-scale data infrastructure. He developed the College Prep and CIRCUIT workforce-development models, through which he has mentored nearly 500 students, and his current work develops quantitative measures of human cognitive performance in operational contexts. He leads the development of the LENS (Learning Engineering for Next-Generation Systems) concentration within the Johns Hopkins Master of Education in Learning Design and Technology, the program directed by James Diamond at the School of Education. Gray-Roncal holds a Ph.D. in Computer Science from Johns Hopkins, an M.S. in Electrical Engineering from the University of Southern California, and a B.S. in Electrical Engineering from Vanderbilt.</w:t>
       </w:r>
     </w:p>
     <w:p>
@@ -87,7 +87,7 @@
         <w:pStyle w:val="BodyText"/>
       </w:pPr>
       <w:r>
-        <w:t xml:space="preserve">James Diamond, Ph.D., is Assistant Professor in the Johns Hopkins University School of Education and Program Director of the Master of Education in Learning Design and Technology, where he applies design-based research and learning-sciences methods to the design and evaluation of technology-mediated learning environments. His research, supported by the National Science Foundation, the Institute of Education Sciences, the Bill &amp; Melinda Gates Foundation, the MacArthur Foundation’s HASTAC Digital Media and Learning Initiative, the Robin Hood Learning + Technology Fund, the Wellcome Trust, and the UK Economic and Social Research Council, bridges digital games and simulations for learning, digital badges and micro-credentialing, classroom technology integration, and disciplinary literacy in history, social studies, civics, and STEM. Before joining Johns Hopkins, he was Senior Research Associate at the Education Development Center’s Center for Children and Technology in New York City, where he led projects including Zoom In and the Who Built America? Teacher Mastery Badge System, contributed to Mission US and Possible Worlds, and taught at New York University as an adjunct. As Program Director, he oversees the LDT program within which the LENS specialization is offered. Diamond holds a Ph.D. in Educational Communication and Technology from New York University, an Ed.M. in Educational Technology from Boston University, and a B.A. in History from Boston University.</w:t>
+        <w:t xml:space="preserve">James Diamond, Ph.D., is Assistant Professor in the Johns Hopkins University School of Education and Program Director of the Master of Education in Learning Design and Technology, where he applies design-based research and learning-sciences methods to the design and evaluation of technology-mediated learning environments. His research, supported by the National Science Foundation, the Institute of Education Sciences, the Bill &amp; Melinda Gates Foundation, the MacArthur Foundation’s HASTAC Digital Media and Learning Initiative, the Robin Hood Learning + Technology Fund, the Wellcome Trust, and the UK Economic and Social Research Council, bridges digital games and simulations for learning, digital badges and micro-credentialing, classroom technology integration, and disciplinary literacy in history, social studies, civics, and STEM. Before joining Johns Hopkins, he was Senior Research Associate at the Education Development Center’s Center for Children and Technology in New York City, where he led projects including Zoom In and the Who Built America? Teacher Mastery Badge System, contributed to Mission US and Possible Worlds, and taught at New York University as an adjunct. As Program Director, he oversees the LDT program within which the LENS concentration is offered. Diamond holds a Ph.D. in Educational Communication and Technology from New York University, an Ed.M. in Educational Technology from Boston University, and a B.A. in History from Boston University.</w:t>
       </w:r>
     </w:p>
     <w:p>
@@ -103,7 +103,7 @@
         <w:pStyle w:val="BodyText"/>
       </w:pPr>
       <w:r>
-        <w:t xml:space="preserve">These biographies reference careers documented in publications, program reports, faculty pages, and the curricular materials of the LDT program and the LENS specialization.</w:t>
+        <w:t xml:space="preserve">These biographies reference careers documented in publications, program reports, faculty pages, and the curricular materials of the LDT program and the LENS concentration.</w:t>
       </w:r>
     </w:p>
     <w:p>
@@ -172,7 +172,7 @@
         <w:t xml:space="preserve">“</w:t>
       </w:r>
       <w:r>
-        <w:t xml:space="preserve">Leads the LENS specialization</w:t>
+        <w:t xml:space="preserve">Leads the LENS concentration</w:t>
       </w:r>
       <w:r>
         <w:t xml:space="preserve">”</w:t>
@@ -190,7 +190,7 @@
         <w:t xml:space="preserve">“</w:t>
       </w:r>
       <w:r>
-        <w:t xml:space="preserve">leads the development of the LENS specialization within … the program directed by James Diamond.</w:t>
+        <w:t xml:space="preserve">leads the development of the LENS concentration within … the program directed by James Diamond.</w:t>
       </w:r>
       <w:r>
         <w:t xml:space="preserve">”</w:t>
@@ -735,6 +735,18 @@
     <w:unhideWhenUsed/>
     <w:qFormat/>
   </w:style>
+  <w:style w:styleId="FootnoteBlockText" w:type="paragraph">
+    <w:name w:val="Footnote Block Text"/>
+    <w:basedOn w:val="Footnote Text"/>
+    <w:next w:val="Footnote Text"/>
+    <w:uiPriority w:val="9"/>
+    <w:unhideWhenUsed/>
+    <w:qFormat/>
+    <w:pPr>
+      <w:spacing w:after="100" w:before="100"/>
+      <w:ind w:firstLine="0" w:left="480" w:right="480"/>
+    </w:pPr>
+  </w:style>
   <w:style w:default="1" w:styleId="DefaultParagraphFont" w:type="character">
     <w:name w:val="Default Paragraph Font"/>
     <w:semiHidden/>
@@ -743,37 +755,31 @@
   <w:style w:default="1" w:styleId="Table" w:type="table">
     <w:name w:val="Table"/>
     <w:basedOn w:val="TableNormal"/>
+    <w:semiHidden/>
+    <w:unhideWhenUsed/>
     <w:qFormat/>
     <w:tblPr>
       <w:tblInd w:type="dxa" w:w="0"/>
-      <w:tblBorders>
-        <w:top w:color="BFBFBF" w:space="0" w:sz="4" w:val="single"/>
-        <w:left w:color="BFBFBF" w:space="0" w:sz="4" w:val="single"/>
-        <w:bottom w:color="BFBFBF" w:space="0" w:sz="4" w:val="single"/>
-        <w:right w:color="BFBFBF" w:space="0" w:sz="4" w:val="single"/>
-        <w:insideH w:color="BFBFBF" w:space="0" w:sz="4" w:val="single"/>
-        <w:insideV w:color="BFBFBF" w:space="0" w:sz="4" w:val="single"/>
-      </w:tblBorders>
       <w:tblCellMar>
-        <w:top w:type="dxa" w:w="40"/>
+        <w:top w:type="dxa" w:w="0"/>
         <w:left w:type="dxa" w:w="108"/>
-        <w:bottom w:type="dxa" w:w="40"/>
+        <w:bottom w:type="dxa" w:w="0"/>
         <w:right w:type="dxa" w:w="108"/>
       </w:tblCellMar>
     </w:tblPr>
     <w:tblStylePr w:type="firstRow">
-      <w:rPr>
-        <w:b/>
-        <w:color w:val="FFFFFF"/>
-      </w:rPr>
+      <w:tblPr>
+        <w:jc w:val="left"/>
+        <w:tblInd w:type="dxa" w:w="0"/>
+      </w:tblPr>
+      <w:trPr>
+        <w:jc w:val="left"/>
+      </w:trPr>
       <w:tcPr>
-        <w:shd w:color="auto" w:fill="1F3B63" w:val="clear"/>
-        <w:vAlign w:val="center"/>
-      </w:tcPr>
-    </w:tblStylePr>
-    <w:tblStylePr w:type="band1Horz">
-      <w:tcPr>
-        <w:shd w:color="auto" w:fill="EEF2F7" w:val="clear"/>
+        <w:vAlign w:val="bottom"/>
+        <w:tcBorders>
+          <w:bottom w:val="single"/>
+        </w:tcBorders>
       </w:tcPr>
     </w:tblStylePr>
   </w:style>
@@ -1130,7 +1136,7 @@
         <a:srgbClr val="EEECE1"/>
       </a:lt2>
       <a:accent1>
-        <a:srgbClr val="1F3B63"/>
+        <a:srgbClr val="4F81BD"/>
       </a:accent1>
       <a:accent2>
         <a:srgbClr val="C0504D"/>

</xml_diff>